<commit_message>
Deploy preview for PR 127 🛫
</commit_message>
<xml_diff>
--- a/pr-preview/pr-127/chapters/04-effect-modification-tracked-changes.docx
+++ b/pr-preview/pr-127/chapters/04-effect-modification-tracked-changes.docx
@@ -17026,7 +17026,7 @@
               <w:t xml:space="preserve"> </w:t>
             </w:r>
             <w:r>
-              <w:t xml:space="preserve">Assume consistency, partial exchangeability</w:t>
+              <w:t xml:space="preserve">Assume consistency and partial exchangeability</w:t>
             </w:r>
             <w:r>
               <w:t xml:space="preserve"> </w:t>
@@ -17107,13 +17107,13 @@
               </w:r>
             </w:hyperlink>
             <w:r>
-              <w:t xml:space="preserve">),</w:t>
-            </w:r>
-            <w:r>
-              <w:t xml:space="preserve"> </w:t>
-            </w:r>
-            <w:r>
-              <w:t xml:space="preserve">and positivity</w:t>
+              <w:t xml:space="preserve">).</w:t>
+            </w:r>
+            <w:r>
+              <w:t xml:space="preserve"> </w:t>
+            </w:r>
+            <w:r>
+              <w:t xml:space="preserve">Let</w:t>
             </w:r>
             <w:r>
               <w:t xml:space="preserve"> </w:t>
@@ -17129,134 +17129,8 @@
                 <m:t>(</m:t>
               </m:r>
               <m:r>
-                <m:t>a</m:t>
-              </m:r>
-              <m:r>
-                <m:rPr>
-                  <m:sty m:val="p"/>
-                </m:rPr>
-                <m:t>∣</m:t>
-              </m:r>
-              <m:r>
-                <m:t>l</m:t>
-              </m:r>
-              <m:r>
-                <m:rPr>
-                  <m:sty m:val="p"/>
-                </m:rPr>
-                <m:t>)</m:t>
-              </m:r>
-              <m:r>
-                <m:rPr>
-                  <m:sty m:val="p"/>
-                </m:rPr>
-                <m:t>&gt;</m:t>
-              </m:r>
-              <m:r>
-                <m:t>0</m:t>
-              </m:r>
-            </m:oMath>
-            <w:r>
-              <w:t xml:space="preserve"> </w:t>
-            </w:r>
-            <w:r>
-              <w:t xml:space="preserve">for every</w:t>
-            </w:r>
-            <w:r>
-              <w:t xml:space="preserve"> </w:t>
-            </w:r>
-            <m:oMath>
-              <m:r>
-                <m:t>l</m:t>
-              </m:r>
-            </m:oMath>
-            <w:r>
-              <w:t xml:space="preserve"> </w:t>
-            </w:r>
-            <w:r>
-              <w:t xml:space="preserve">with</w:t>
-            </w:r>
-            <w:r>
-              <w:t xml:space="preserve"> </w:t>
-            </w:r>
-            <m:oMath>
-              <m:r>
-                <m:rPr>
-                  <m:sty m:val="p"/>
-                </m:rPr>
-                <m:t>Pr</m:t>
-              </m:r>
-              <m:r>
-                <m:rPr>
-                  <m:sty m:val="p"/>
-                </m:rPr>
-                <m:t>[</m:t>
-              </m:r>
-              <m:r>
-                <m:t>L</m:t>
-              </m:r>
-              <m:r>
-                <m:rPr>
-                  <m:sty m:val="p"/>
-                </m:rPr>
-                <m:t>=</m:t>
-              </m:r>
-              <m:r>
-                <m:t>l</m:t>
-              </m:r>
-              <m:r>
-                <m:rPr>
-                  <m:sty m:val="p"/>
-                </m:rPr>
-                <m:t>]</m:t>
-              </m:r>
-              <m:r>
-                <m:rPr>
-                  <m:sty m:val="p"/>
-                </m:rPr>
-                <m:t>&gt;</m:t>
-              </m:r>
-              <m:r>
-                <m:t>0</m:t>
-              </m:r>
-            </m:oMath>
-            <w:r>
-              <w:t xml:space="preserve">,</w:t>
-            </w:r>
-            <w:r>
-              <w:t xml:space="preserve"> </w:t>
-            </w:r>
-            <w:r>
-              <w:t xml:space="preserve">where</w:t>
-            </w:r>
-            <w:r>
-              <w:t xml:space="preserve"> </w:t>
-            </w:r>
-            <m:oMath>
-              <m:r>
-                <m:t>f</m:t>
-              </m:r>
-              <m:r>
-                <m:rPr>
-                  <m:sty m:val="p"/>
-                </m:rPr>
-                <m:t>(</m:t>
-              </m:r>
-              <m:sSup>
-                <m:e>
-                  <m:r>
-                    <m:t>a</m:t>
-                  </m:r>
-                </m:e>
-                <m:sup>
-                  <m:r>
-                    <m:rPr>
-                      <m:sty m:val="p"/>
-                    </m:rPr>
-                    <m:t>′</m:t>
-                  </m:r>
-                </m:sup>
-              </m:sSup>
+                <m:t>x</m:t>
+              </m:r>
               <m:r>
                 <m:rPr>
                   <m:sty m:val="p"/>
@@ -17312,21 +17186,9 @@
                 </m:rPr>
                 <m:t>=</m:t>
               </m:r>
-              <m:sSup>
-                <m:e>
-                  <m:r>
-                    <m:t>a</m:t>
-                  </m:r>
-                </m:e>
-                <m:sup>
-                  <m:r>
-                    <m:rPr>
-                      <m:sty m:val="p"/>
-                    </m:rPr>
-                    <m:t>′</m:t>
-                  </m:r>
-                </m:sup>
-              </m:sSup>
+              <m:r>
+                <m:t>x</m:t>
+              </m:r>
               <m:r>
                 <m:rPr>
                   <m:sty m:val="p"/>
@@ -17356,7 +17218,7 @@
               <w:t xml:space="preserve"> </w:t>
             </w:r>
             <w:r>
-              <w:t xml:space="preserve">is the conditional probability mass function of</w:t>
+              <w:t xml:space="preserve">be the conditional probability mass function of</w:t>
             </w:r>
             <w:r>
               <w:t xml:space="preserve"> </w:t>
@@ -17378,6 +17240,120 @@
             <m:oMath>
               <m:r>
                 <m:t>L</m:t>
+              </m:r>
+            </m:oMath>
+            <w:r>
+              <w:t xml:space="preserve">,</w:t>
+            </w:r>
+            <w:r>
+              <w:t xml:space="preserve"> </w:t>
+            </w:r>
+            <w:r>
+              <w:t xml:space="preserve">and assume positivity</w:t>
+            </w:r>
+            <w:r>
+              <w:t xml:space="preserve"> </w:t>
+            </w:r>
+            <m:oMath>
+              <m:r>
+                <m:t>f</m:t>
+              </m:r>
+              <m:r>
+                <m:rPr>
+                  <m:sty m:val="p"/>
+                </m:rPr>
+                <m:t>(</m:t>
+              </m:r>
+              <m:r>
+                <m:t>a</m:t>
+              </m:r>
+              <m:r>
+                <m:rPr>
+                  <m:sty m:val="p"/>
+                </m:rPr>
+                <m:t>∣</m:t>
+              </m:r>
+              <m:r>
+                <m:t>l</m:t>
+              </m:r>
+              <m:r>
+                <m:rPr>
+                  <m:sty m:val="p"/>
+                </m:rPr>
+                <m:t>)</m:t>
+              </m:r>
+              <m:r>
+                <m:rPr>
+                  <m:sty m:val="p"/>
+                </m:rPr>
+                <m:t>&gt;</m:t>
+              </m:r>
+              <m:r>
+                <m:t>0</m:t>
+              </m:r>
+            </m:oMath>
+            <w:r>
+              <w:t xml:space="preserve"> </w:t>
+            </w:r>
+            <w:r>
+              <w:t xml:space="preserve">for every</w:t>
+            </w:r>
+            <w:r>
+              <w:t xml:space="preserve"> </w:t>
+            </w:r>
+            <m:oMath>
+              <m:r>
+                <m:t>l</m:t>
+              </m:r>
+            </m:oMath>
+            <w:r>
+              <w:t xml:space="preserve"> </w:t>
+            </w:r>
+            <w:r>
+              <w:t xml:space="preserve">with</w:t>
+            </w:r>
+            <w:r>
+              <w:t xml:space="preserve"> </w:t>
+            </w:r>
+            <m:oMath>
+              <m:r>
+                <m:rPr>
+                  <m:sty m:val="p"/>
+                </m:rPr>
+                <m:t>Pr</m:t>
+              </m:r>
+              <m:r>
+                <m:rPr>
+                  <m:sty m:val="p"/>
+                </m:rPr>
+                <m:t>[</m:t>
+              </m:r>
+              <m:r>
+                <m:t>L</m:t>
+              </m:r>
+              <m:r>
+                <m:rPr>
+                  <m:sty m:val="p"/>
+                </m:rPr>
+                <m:t>=</m:t>
+              </m:r>
+              <m:r>
+                <m:t>l</m:t>
+              </m:r>
+              <m:r>
+                <m:rPr>
+                  <m:sty m:val="p"/>
+                </m:rPr>
+                <m:t>]</m:t>
+              </m:r>
+              <m:r>
+                <m:rPr>
+                  <m:sty m:val="p"/>
+                </m:rPr>
+                <m:t>&gt;</m:t>
+              </m:r>
+              <m:r>
+                <m:t>0</m:t>
               </m:r>
             </m:oMath>
             <w:r>
@@ -23225,7 +23201,10 @@
               </m:r>
             </m:oMath>
             <w:r>
-              <w:t xml:space="preserve">.</w:t>
+              <w:t xml:space="preserve"> </w:t>
+            </w:r>
+            <w:r>
+              <w:t xml:space="preserve">(when its denominator is positive).</w:t>
             </w:r>
             <w:r>
               <w:t xml:space="preserve"> </w:t>
@@ -23363,7 +23342,75 @@
               </m:r>
             </m:oMath>
             <w:r>
-              <w:t xml:space="preserve">.</w:t>
+              <w:t xml:space="preserve"> </w:t>
+            </w:r>
+            <w:r>
+              <w:t xml:space="preserve">(when</w:t>
+            </w:r>
+            <w:r>
+              <w:t xml:space="preserve"> </w:t>
+            </w:r>
+            <m:oMath>
+              <m:r>
+                <m:rPr>
+                  <m:sty m:val="p"/>
+                </m:rPr>
+                <m:t>Pr</m:t>
+              </m:r>
+              <m:r>
+                <m:rPr>
+                  <m:sty m:val="p"/>
+                </m:rPr>
+                <m:t>[</m:t>
+              </m:r>
+              <m:sSup>
+                <m:e>
+                  <m:r>
+                    <m:t>Y</m:t>
+                  </m:r>
+                </m:e>
+                <m:sup>
+                  <m:r>
+                    <m:t>a</m:t>
+                  </m:r>
+                  <m:r>
+                    <m:rPr>
+                      <m:sty m:val="p"/>
+                    </m:rPr>
+                    <m:t>=</m:t>
+                  </m:r>
+                  <m:r>
+                    <m:t>0</m:t>
+                  </m:r>
+                </m:sup>
+              </m:sSup>
+              <m:r>
+                <m:rPr>
+                  <m:sty m:val="p"/>
+                </m:rPr>
+                <m:t>=</m:t>
+              </m:r>
+              <m:r>
+                <m:t>1</m:t>
+              </m:r>
+              <m:r>
+                <m:rPr>
+                  <m:sty m:val="p"/>
+                </m:rPr>
+                <m:t>]</m:t>
+              </m:r>
+              <m:r>
+                <m:rPr>
+                  <m:sty m:val="p"/>
+                </m:rPr>
+                <m:t>&gt;</m:t>
+              </m:r>
+              <m:r>
+                <m:t>0</m:t>
+              </m:r>
+            </m:oMath>
+            <w:r>
+              <w:t xml:space="preserve">).</w:t>
             </w:r>
           </w:p>
           <w:bookmarkEnd w:id="74"/>
@@ -24772,6 +24819,29 @@
             </w:r>
             <w:r>
               <w:t xml:space="preserve"> (The Reference Group Sets the Target Population). </w:t>
+            </w:r>
+            <w:r>
+              <w:t xml:space="preserve">Under consistency, conditional exchangeability given</w:t>
+            </w:r>
+            <w:r>
+              <w:t xml:space="preserve"> </w:t>
+            </w:r>
+            <m:oMath>
+              <m:r>
+                <m:t>L</m:t>
+              </m:r>
+            </m:oMath>
+            <w:r>
+              <w:t xml:space="preserve">, and positivity,</w:t>
+            </w:r>
+            <w:r>
+              <w:t xml:space="preserve"> </w:t>
+            </w:r>
+            <w:r>
+              <w:t xml:space="preserve">the matched population supports a direct comparison of the treated and the untreated.</w:t>
+            </w:r>
+            <w:r>
+              <w:t xml:space="preserve"> </w:t>
             </w:r>
             <w:r>
               <w:t xml:space="preserve">In matching (</w:t>

</xml_diff>